<commit_message>
Save final Main changes
</commit_message>
<xml_diff>
--- a/details/Weatherly 2 Page Summary.docx
+++ b/details/Weatherly 2 Page Summary.docx
@@ -458,21 +458,7 @@
         <w:ind w:left="259" w:hanging="173"/>
       </w:pPr>
       <w:r>
-        <w:rPr>
-          <w:sz w:val="17"/>
-          <w:szCs w:val="17"/>
-          <w:rtl w:val="0"/>
-        </w:rPr>
-        <w:t xml:space="preserve">• </w:t>
-      </w:r>
-      <w:r>
-        <w:rPr>
-          <w:sz w:val="17"/>
-          <w:szCs w:val="17"/>
-          <w:rtl w:val="0"/>
-          <w:lang w:val="en-US"/>
-        </w:rPr>
-        <w:t>Local file processing using users.txt.</w:t>
+        <w:t>• Encrypted local user storage in users.dat using RandomAccessFile.</w:t>
       </w:r>
     </w:p>
     <w:p>
@@ -1720,59 +1706,76 @@
             <w:vAlign w:val="top"/>
           </w:tcPr>
           <w:p>
-            <w:pPr>
-              <w:pStyle w:val="Body"/>
-              <w:jc w:val="center"/>
-              <w:rPr>
-                <w:shd w:val="nil" w:color="auto" w:fill="auto"/>
-              </w:rPr>
-            </w:pPr>
             <w:r>
-              <w:rPr>
-                <w:b w:val="1"/>
-                <w:bCs w:val="1"/>
-                <w:outline w:val="0"/>
-                <w:color w:val="102a43"/>
-                <w:sz w:val="17"/>
-                <w:szCs w:val="17"/>
-                <w:u w:color="102a43"/>
-                <w:shd w:val="nil" w:color="auto" w:fill="auto"/>
-                <w:rtl w:val="0"/>
-                <w:lang w:val="en-US"/>
-                <w14:textFill>
-                  <w14:solidFill>
-                    <w14:srgbClr w14:val="102A43"/>
-                  </w14:solidFill>
-                </w14:textFill>
-              </w:rPr>
-              <w:t>users.txt</w:t>
-            </w:r>
-          </w:p>
-          <w:p>
-            <w:pPr>
-              <w:pStyle w:val="Body"/>
-              <w:bidi w:val="0"/>
-              <w:spacing w:after="0"/>
-              <w:ind w:left="0" w:right="0" w:firstLine="0"/>
-              <w:jc w:val="center"/>
-              <w:rPr>
-                <w:rtl w:val="0"/>
-              </w:rPr>
-            </w:pPr>
-            <w:r>
-              <w:rPr>
-                <w:sz w:val="14"/>
-                <w:szCs w:val="14"/>
-                <w:shd w:val="nil" w:color="auto" w:fill="auto"/>
-                <w:rtl w:val="0"/>
-                <w:lang w:val="en-US"/>
-              </w:rPr>
-              <w:t>Stores registered users locally and is read during login verification.</w:t>
+              <w:t>User.java &amp; UserFileManager.java</w:t>
+              <w:br/>
+              <w:t>Store encrypted user records in users.dat using RandomAccessFile.</w:t>
             </w:r>
           </w:p>
         </w:tc>
       </w:tr>
     </w:tbl>
+    <w:p>
+      <w:r>
+        <w:rPr>
+          <w:b/>
+          <w:sz w:val="22"/>
+        </w:rPr>
+        <w:t>Developer Verification</w:t>
+      </w:r>
+    </w:p>
+    <w:p>
+      <w:pPr>
+        <w:jc w:val="center"/>
+      </w:pPr>
+      <w:r>
+        <w:drawing>
+          <wp:inline xmlns:a="http://schemas.openxmlformats.org/drawingml/2006/main" xmlns:pic="http://schemas.openxmlformats.org/drawingml/2006/picture">
+            <wp:extent cx="3017520" cy="1612812"/>
+            <wp:docPr id="1073741831" name="Picture 1073741831"/>
+            <wp:cNvGraphicFramePr>
+              <a:graphicFrameLocks noChangeAspect="1"/>
+            </wp:cNvGraphicFramePr>
+            <a:graphic>
+              <a:graphicData uri="http://schemas.openxmlformats.org/drawingml/2006/picture">
+                <pic:pic>
+                  <pic:nvPicPr>
+                    <pic:cNvPr id="0" name="Screenshot 2026-05-13 at 20.41.53.png"/>
+                    <pic:cNvPicPr/>
+                  </pic:nvPicPr>
+                  <pic:blipFill>
+                    <a:blip r:embed="rId13"/>
+                    <a:stretch>
+                      <a:fillRect/>
+                    </a:stretch>
+                  </pic:blipFill>
+                  <pic:spPr>
+                    <a:xfrm>
+                      <a:off x="0" y="0"/>
+                      <a:ext cx="3017520" cy="1612812"/>
+                    </a:xfrm>
+                    <a:prstGeom prst="rect"/>
+                  </pic:spPr>
+                </pic:pic>
+              </a:graphicData>
+            </a:graphic>
+          </wp:inline>
+        </w:drawing>
+      </w:r>
+    </w:p>
+    <w:p>
+      <w:pPr>
+        <w:jc w:val="center"/>
+      </w:pPr>
+      <w:r>
+        <w:rPr>
+          <w:b w:val="0"/>
+          <w:i/>
+          <w:sz w:val="14"/>
+        </w:rPr>
+        <w:t>Console verification of decrypted encrypted user records.</w:t>
+      </w:r>
+    </w:p>
     <w:p>
       <w:pPr>
         <w:pStyle w:val="Body"/>
@@ -1812,13 +1815,7 @@
         <w:spacing w:after="0"/>
       </w:pPr>
       <w:r>
-        <w:rPr>
-          <w:sz w:val="16"/>
-          <w:szCs w:val="16"/>
-          <w:rtl w:val="0"/>
-          <w:lang w:val="en-US"/>
-        </w:rPr>
-        <w:t>Weatherly meets the Programming II project requirements by combining JavaFX GUI design, authentication, local file processing, live API communication, animation, and a clear user interface. The project is uploaded to GitHub with a README and can be run from IntelliJ using the JavaFX Maven plugin.</w:t>
+        <w:t>Weatherly meets the Programming II project requirements by combining JavaFX GUI design, authentication, encrypted binary file processing, live API communication, animation, and a clear user interface. The project is uploaded to GitHub with a README and can be run from IntelliJ using the JavaFX Maven plugin.</w:t>
       </w:r>
     </w:p>
     <w:p>

</xml_diff>